<commit_message>
Detecao e classificacao 100%
</commit_message>
<xml_diff>
--- a/PJ2_PIV_51388_51452.docx
+++ b/PJ2_PIV_51388_51452.docx
@@ -318,7 +318,7 @@
         <mc:AlternateContent>
           <mc:Choice Requires="wps">
             <w:drawing>
-              <wp:anchor distT="0" distB="0" distL="114300" distR="114300" simplePos="0" relativeHeight="251659264" behindDoc="0" locked="0" layoutInCell="1" allowOverlap="1" wp14:anchorId="43236310" wp14:editId="0330212E">
+              <wp:anchor distT="0" distB="0" distL="114300" distR="114300" simplePos="0" relativeHeight="251658240" behindDoc="0" locked="0" layoutInCell="1" allowOverlap="1" wp14:anchorId="43236310" wp14:editId="0330212E">
                 <wp:simplePos x="0" y="0"/>
                 <wp:positionH relativeFrom="margin">
                   <wp:align>right</wp:align>
@@ -553,7 +553,7 @@
                 <v:stroke joinstyle="miter"/>
                 <v:path gradientshapeok="t" o:connecttype="rect"/>
               </v:shapetype>
-              <v:shape id="Text Box 146" o:spid="_x0000_s1026" type="#_x0000_t202" style="position:absolute;margin-left:373.7pt;margin-top:621.6pt;width:424.9pt;height:122.55pt;z-index:251659264;visibility:visible;mso-wrap-style:square;mso-height-percent:0;mso-wrap-distance-left:9pt;mso-wrap-distance-top:0;mso-wrap-distance-right:9pt;mso-wrap-distance-bottom:0;mso-position-horizontal:right;mso-position-horizontal-relative:margin;mso-position-vertical:absolute;mso-position-vertical-relative:page;mso-height-percent:0;mso-height-relative:margin;v-text-anchor:bottom" o:gfxdata="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" filled="f" stroked="f">
+              <v:shape id="Text Box 146" o:spid="_x0000_s1026" type="#_x0000_t202" style="position:absolute;margin-left:373.7pt;margin-top:621.6pt;width:424.9pt;height:122.55pt;z-index:251658240;visibility:visible;mso-wrap-style:square;mso-height-percent:0;mso-wrap-distance-left:9pt;mso-wrap-distance-top:0;mso-wrap-distance-right:9pt;mso-wrap-distance-bottom:0;mso-position-horizontal:right;mso-position-horizontal-relative:margin;mso-position-vertical:absolute;mso-position-vertical-relative:page;mso-height-percent:0;mso-height-relative:margin;v-text-anchor:bottom" o:gfxdata="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" filled="f" stroked="f">
                 <v:textbox inset="0,0,0,0">
                   <w:txbxContent>
                     <w:p>
@@ -2287,6 +2287,7 @@
         <w:t xml:space="preserve"> </w:t>
       </w:r>
     </w:p>
+    <w:p/>
     <w:p>
       <w:pPr>
         <w:spacing w:line="278" w:lineRule="auto"/>
@@ -2306,7 +2307,109 @@
         <w:t>OPENCV -</w:t>
       </w:r>
       <w:r>
-        <w:t>Open Source Computer Vision</w:t>
+        <w:t xml:space="preserve">Open </w:t>
+      </w:r>
+      <w:proofErr w:type="spellStart"/>
+      <w:r>
+        <w:t>Source</w:t>
+      </w:r>
+      <w:proofErr w:type="spellEnd"/>
+      <w:r>
+        <w:t xml:space="preserve"> </w:t>
+      </w:r>
+      <w:proofErr w:type="spellStart"/>
+      <w:r>
+        <w:t>Computer</w:t>
+      </w:r>
+      <w:proofErr w:type="spellEnd"/>
+      <w:r>
+        <w:t xml:space="preserve"> </w:t>
+      </w:r>
+      <w:proofErr w:type="spellStart"/>
+      <w:r>
+        <w:t>Vision</w:t>
+      </w:r>
+      <w:proofErr w:type="spellEnd"/>
+    </w:p>
+    <w:p>
+      <w:pPr>
+        <w:suppressAutoHyphens w:val="0"/>
+      </w:pPr>
+    </w:p>
+    <w:p>
+      <w:pPr>
+        <w:pStyle w:val="Ttulo1"/>
+      </w:pPr>
+      <w:r>
+        <w:t xml:space="preserve">Fundamentos Teóricos </w:t>
+      </w:r>
+    </w:p>
+    <w:p>
+      <w:pPr>
+        <w:jc w:val="both"/>
+      </w:pPr>
+    </w:p>
+    <w:p>
+      <w:pPr>
+        <w:suppressAutoHyphens w:val="0"/>
+        <w:ind w:firstLine="432"/>
+        <w:jc w:val="both"/>
+      </w:pPr>
+      <w:r>
+        <w:t>Abertura: Operação morfológica composta pela erosão seguida de uma dilatação usando o mesmo elemento estruturante. Possui como principal objetivo eliminar pequenos objetos ou ruido isolado da imagem.</w:t>
+      </w:r>
+    </w:p>
+    <w:p>
+      <w:pPr>
+        <w:suppressAutoHyphens w:val="0"/>
+        <w:ind w:firstLine="432"/>
+        <w:jc w:val="both"/>
+      </w:pPr>
+      <w:r>
+        <w:t>Fecho: Operação morfológica composta pela dilatação seguida de erosão, com o mesmo elemento estruturante. Empregue para preencher pequenos buracos e unir descontinuidades nos contornos de regiões brancas, nomeadamente objetos</w:t>
+      </w:r>
+    </w:p>
+    <w:p>
+      <w:pPr>
+        <w:suppressAutoHyphens w:val="0"/>
+        <w:ind w:firstLine="432"/>
+        <w:jc w:val="both"/>
+      </w:pPr>
+      <w:r>
+        <w:t>Erosão: Permite reduzir o tamanho das regiões brancas duma imagem binaria, removendo os pixéis das fronteiras. P</w:t>
+      </w:r>
+      <w:r>
+        <w:t>ossui como efeito separar objetos próximos e eliminar imperfeições pequenas.</w:t>
+      </w:r>
+    </w:p>
+    <w:p>
+      <w:pPr>
+        <w:suppressAutoHyphens w:val="0"/>
+        <w:ind w:firstLine="432"/>
+        <w:jc w:val="both"/>
+      </w:pPr>
+      <w:r>
+        <w:t>Dilatação: Processo inverso á erosão, consistindo na expansão das regiões brancas da imagem, acrescentando pixéis brancos nas fronteiras.</w:t>
+      </w:r>
+    </w:p>
+    <w:p>
+      <w:pPr>
+        <w:suppressAutoHyphens w:val="0"/>
+        <w:ind w:firstLine="432"/>
+        <w:jc w:val="both"/>
+      </w:pPr>
+      <w:r>
+        <w:t>Binarização: Processo de converter uma imagem noutro com pixéis a branco com valor 255e preto com valor 0.</w:t>
+      </w:r>
+    </w:p>
+    <w:p>
+      <w:pPr>
+        <w:suppressAutoHyphens w:val="0"/>
+        <w:ind w:firstLine="432"/>
+        <w:jc w:val="both"/>
+      </w:pPr>
+      <w:r>
+        <w:t>Matriz de confusão: Representação que permite comparar as classes verdadeiras das classes preditas pelo sistema de classificação. Cada linha corresponde á classe verdadeira e cada coluna á classe predita. Os valores na diagonal indicam a classificação correta, enquanto os restantes representam os erros. Permite calcular outras métricas de desempenho, como a precisão e probabilidade de erro.</w:t>
       </w:r>
     </w:p>
     <w:p>
@@ -2319,26 +2422,154 @@
           <w:szCs w:val="40"/>
         </w:rPr>
       </w:pPr>
+      <w:r>
+        <w:br w:type="page"/>
+      </w:r>
     </w:p>
     <w:p>
       <w:pPr>
         <w:pStyle w:val="Ttulo1"/>
       </w:pPr>
       <w:bookmarkStart w:id="6" w:name="_Toc214535270"/>
-      <w:r>
+      <w:proofErr w:type="spellStart"/>
+      <w:r>
+        <w:lastRenderedPageBreak/>
         <w:t>Abstract</w:t>
       </w:r>
       <w:bookmarkEnd w:id="6"/>
-    </w:p>
-    <w:p>
-      <w:r>
-        <w:t>Breve texto com o procedimento do projeto</w:t>
-      </w:r>
-    </w:p>
-    <w:p/>
+      <w:proofErr w:type="spellEnd"/>
+    </w:p>
+    <w:p>
+      <w:pPr>
+        <w:jc w:val="both"/>
+      </w:pPr>
+      <w:r>
+        <w:t xml:space="preserve">Este trabalho apresenta o desenvolvimento dum sistema de </w:t>
+      </w:r>
+      <w:r>
+        <w:t>deteção</w:t>
+      </w:r>
+      <w:r>
+        <w:t xml:space="preserve"> e contagem de veículos </w:t>
+      </w:r>
+      <w:r>
+        <w:t xml:space="preserve">utilizando as bibliotecas </w:t>
+      </w:r>
+      <w:proofErr w:type="spellStart"/>
+      <w:r>
+        <w:t>OpenCV</w:t>
+      </w:r>
+      <w:proofErr w:type="spellEnd"/>
+      <w:r>
+        <w:t xml:space="preserve">, </w:t>
+      </w:r>
+      <w:proofErr w:type="spellStart"/>
+      <w:r>
+        <w:t>Numpy</w:t>
+      </w:r>
+      <w:proofErr w:type="spellEnd"/>
+      <w:r>
+        <w:t xml:space="preserve"> e </w:t>
+      </w:r>
+      <w:proofErr w:type="spellStart"/>
+      <w:r>
+        <w:t>Matplotlib</w:t>
+      </w:r>
+      <w:proofErr w:type="spellEnd"/>
+      <w:r>
+        <w:t xml:space="preserve"> da linguagem </w:t>
+      </w:r>
+      <w:proofErr w:type="spellStart"/>
+      <w:r>
+        <w:t>Python</w:t>
+      </w:r>
+      <w:proofErr w:type="spellEnd"/>
+      <w:r>
+        <w:t xml:space="preserve">. O sistema aplica </w:t>
+      </w:r>
+      <w:r>
+        <w:t xml:space="preserve">primeiro a </w:t>
+      </w:r>
+      <w:r>
+        <w:t>correção</w:t>
+      </w:r>
+      <w:r>
+        <w:t xml:space="preserve"> de </w:t>
+      </w:r>
+      <w:r>
+        <w:t>perspetiva</w:t>
+      </w:r>
+      <w:r>
+        <w:t xml:space="preserve"> para isolar a zona de interesse, seguida da estimação de fundo e </w:t>
+      </w:r>
+      <w:r>
+        <w:t>extração</w:t>
+      </w:r>
+      <w:r>
+        <w:t xml:space="preserve"> das regiões ativas através de operadores morfológicos.</w:t>
+      </w:r>
+      <w:r>
+        <w:t xml:space="preserve"> Para cada </w:t>
+      </w:r>
+      <w:proofErr w:type="spellStart"/>
+      <w:r>
+        <w:t>frame</w:t>
+      </w:r>
+      <w:proofErr w:type="spellEnd"/>
+      <w:r>
+        <w:t xml:space="preserve"> são identificados os veículos através d</w:t>
+      </w:r>
+      <w:r>
+        <w:t>as</w:t>
+      </w:r>
+      <w:r>
+        <w:t xml:space="preserve"> </w:t>
+      </w:r>
+      <w:proofErr w:type="spellStart"/>
+      <w:r>
+        <w:t>bounding</w:t>
+      </w:r>
+      <w:proofErr w:type="spellEnd"/>
+      <w:r>
+        <w:t xml:space="preserve"> boxes e os respetivos </w:t>
+      </w:r>
+      <w:r>
+        <w:t xml:space="preserve">centroides, que são depois acompanhados ao longo </w:t>
+      </w:r>
+      <w:r>
+        <w:t xml:space="preserve">do tempo </w:t>
+      </w:r>
+      <w:r>
+        <w:t>através</w:t>
+      </w:r>
+      <w:r>
+        <w:t xml:space="preserve"> de mecanismos de correspondência </w:t>
+      </w:r>
+      <w:r>
+        <w:t xml:space="preserve">baseado em distancia. O sistema depois amostra o vídeo resultante com as </w:t>
+      </w:r>
+      <w:r>
+        <w:t>identificações</w:t>
+      </w:r>
+      <w:r>
+        <w:t xml:space="preserve"> atribuídas a cada veiculo</w:t>
+      </w:r>
+      <w:r>
+        <w:t xml:space="preserve"> de acordo com o centroide calculado</w:t>
+      </w:r>
+      <w:r>
+        <w:t>.</w:t>
+      </w:r>
+    </w:p>
+    <w:p>
+      <w:pPr>
+        <w:jc w:val="both"/>
+      </w:pPr>
+    </w:p>
     <w:p>
       <w:pPr>
         <w:pStyle w:val="Ttulo1"/>
+        <w:jc w:val="both"/>
       </w:pPr>
       <w:bookmarkStart w:id="7" w:name="_Toc214535271"/>
       <w:r>
@@ -2347,6 +2578,9 @@
       <w:bookmarkEnd w:id="7"/>
     </w:p>
     <w:p>
+      <w:pPr>
+        <w:jc w:val="both"/>
+      </w:pPr>
       <w:r>
         <w:t xml:space="preserve">O projeto </w:t>
       </w:r>
@@ -2365,18 +2599,27 @@
           <w:numId w:val="2"/>
         </w:numPr>
         <w:jc w:val="both"/>
-      </w:pPr>
-      <w:r>
         <w:rPr>
           <w:rFonts w:asciiTheme="minorHAnsi" w:hAnsiTheme="minorHAnsi"/>
         </w:rPr>
-        <w:t>Escrever os objetivos do projeto</w:t>
-      </w:r>
+      </w:pPr>
       <w:r>
         <w:rPr>
           <w:rFonts w:asciiTheme="minorHAnsi" w:hAnsiTheme="minorHAnsi"/>
         </w:rPr>
-        <w:t>.</w:t>
+        <w:t xml:space="preserve">Aplicar </w:t>
+      </w:r>
+      <w:r>
+        <w:rPr>
+          <w:rFonts w:asciiTheme="minorHAnsi" w:hAnsiTheme="minorHAnsi"/>
+        </w:rPr>
+        <w:t xml:space="preserve">a </w:t>
+      </w:r>
+      <w:r>
+        <w:rPr>
+          <w:rFonts w:asciiTheme="minorHAnsi" w:hAnsiTheme="minorHAnsi"/>
+        </w:rPr>
+        <w:t>correção de perspetiva para limitar a análise a uma zona de deteção definida manualmente através de quatro pontos.</w:t>
       </w:r>
     </w:p>
     <w:p>
@@ -2387,141 +2630,505 @@
           <w:numId w:val="2"/>
         </w:numPr>
         <w:jc w:val="both"/>
-      </w:pPr>
+        <w:rPr>
+          <w:rFonts w:asciiTheme="minorHAnsi" w:hAnsiTheme="minorHAnsi"/>
+        </w:rPr>
+      </w:pPr>
+      <w:r>
+        <w:rPr>
+          <w:rFonts w:asciiTheme="minorHAnsi" w:hAnsiTheme="minorHAnsi"/>
+        </w:rPr>
+        <w:t xml:space="preserve">Obter </w:t>
+      </w:r>
+      <w:r>
+        <w:rPr>
+          <w:rFonts w:asciiTheme="minorHAnsi" w:hAnsiTheme="minorHAnsi"/>
+        </w:rPr>
+        <w:t>a estimação da imagem do fundo através da aplicação de filtros de média.</w:t>
+      </w:r>
+    </w:p>
+    <w:p>
+      <w:pPr>
+        <w:pStyle w:val="PargrafodaLista"/>
+        <w:numPr>
+          <w:ilvl w:val="0"/>
+          <w:numId w:val="2"/>
+        </w:numPr>
+        <w:jc w:val="both"/>
+        <w:rPr>
+          <w:rFonts w:asciiTheme="minorHAnsi" w:hAnsiTheme="minorHAnsi"/>
+        </w:rPr>
+      </w:pPr>
+      <w:r>
+        <w:rPr>
+          <w:rFonts w:asciiTheme="minorHAnsi" w:hAnsiTheme="minorHAnsi"/>
+        </w:rPr>
+        <w:t>S</w:t>
+      </w:r>
+      <w:r>
+        <w:rPr>
+          <w:rFonts w:asciiTheme="minorHAnsi" w:hAnsiTheme="minorHAnsi"/>
+        </w:rPr>
+        <w:t>ubtra</w:t>
+      </w:r>
+      <w:r>
+        <w:rPr>
+          <w:rFonts w:asciiTheme="minorHAnsi" w:hAnsiTheme="minorHAnsi"/>
+        </w:rPr>
+        <w:t xml:space="preserve">ir ao </w:t>
+      </w:r>
+      <w:r>
+        <w:rPr>
+          <w:rFonts w:asciiTheme="minorHAnsi" w:hAnsiTheme="minorHAnsi"/>
+        </w:rPr>
+        <w:t xml:space="preserve">fundo </w:t>
+      </w:r>
+      <w:r>
+        <w:rPr>
+          <w:rFonts w:asciiTheme="minorHAnsi" w:hAnsiTheme="minorHAnsi"/>
+        </w:rPr>
+        <w:t xml:space="preserve">a zona </w:t>
+      </w:r>
+      <w:r>
+        <w:rPr>
+          <w:rFonts w:asciiTheme="minorHAnsi" w:hAnsiTheme="minorHAnsi"/>
+        </w:rPr>
+        <w:t xml:space="preserve">em interesse com os carros, </w:t>
+      </w:r>
+      <w:r>
+        <w:rPr>
+          <w:rFonts w:asciiTheme="minorHAnsi" w:hAnsiTheme="minorHAnsi"/>
+        </w:rPr>
+        <w:t xml:space="preserve">para obter </w:t>
+      </w:r>
+      <w:r>
+        <w:rPr>
+          <w:rFonts w:asciiTheme="minorHAnsi" w:hAnsiTheme="minorHAnsi"/>
+        </w:rPr>
+        <w:t xml:space="preserve">e </w:t>
+      </w:r>
+      <w:r>
+        <w:rPr>
+          <w:rFonts w:asciiTheme="minorHAnsi" w:hAnsiTheme="minorHAnsi"/>
+        </w:rPr>
+        <w:t>identifica</w:t>
+      </w:r>
+      <w:r>
+        <w:rPr>
+          <w:rFonts w:asciiTheme="minorHAnsi" w:hAnsiTheme="minorHAnsi"/>
+        </w:rPr>
+        <w:t xml:space="preserve">r as </w:t>
+      </w:r>
+      <w:r>
+        <w:rPr>
+          <w:rFonts w:asciiTheme="minorHAnsi" w:hAnsiTheme="minorHAnsi"/>
+        </w:rPr>
+        <w:t xml:space="preserve">regiões em movimento, </w:t>
+      </w:r>
+      <w:r>
+        <w:rPr>
+          <w:rFonts w:asciiTheme="minorHAnsi" w:hAnsiTheme="minorHAnsi"/>
+        </w:rPr>
+        <w:t xml:space="preserve">melhorada </w:t>
+      </w:r>
+      <w:r>
+        <w:rPr>
+          <w:rFonts w:asciiTheme="minorHAnsi" w:hAnsiTheme="minorHAnsi"/>
+        </w:rPr>
+        <w:t xml:space="preserve">por </w:t>
+      </w:r>
+      <w:r>
+        <w:rPr>
+          <w:rFonts w:asciiTheme="minorHAnsi" w:hAnsiTheme="minorHAnsi"/>
+        </w:rPr>
+        <w:t>opera</w:t>
+      </w:r>
+      <w:r>
+        <w:rPr>
+          <w:rFonts w:asciiTheme="minorHAnsi" w:hAnsiTheme="minorHAnsi"/>
+        </w:rPr>
+        <w:t xml:space="preserve">dores </w:t>
+      </w:r>
+      <w:r>
+        <w:rPr>
+          <w:rFonts w:asciiTheme="minorHAnsi" w:hAnsiTheme="minorHAnsi"/>
+        </w:rPr>
+        <w:t>morfológic</w:t>
+      </w:r>
+      <w:r>
+        <w:rPr>
+          <w:rFonts w:asciiTheme="minorHAnsi" w:hAnsiTheme="minorHAnsi"/>
+        </w:rPr>
+        <w:t>o</w:t>
+      </w:r>
+      <w:r>
+        <w:rPr>
+          <w:rFonts w:asciiTheme="minorHAnsi" w:hAnsiTheme="minorHAnsi"/>
+        </w:rPr>
+        <w:t xml:space="preserve">s para </w:t>
+      </w:r>
+      <w:r>
+        <w:rPr>
+          <w:rFonts w:asciiTheme="minorHAnsi" w:hAnsiTheme="minorHAnsi"/>
+        </w:rPr>
+        <w:t xml:space="preserve">a </w:t>
+      </w:r>
+      <w:r>
+        <w:rPr>
+          <w:rFonts w:asciiTheme="minorHAnsi" w:hAnsiTheme="minorHAnsi"/>
+        </w:rPr>
+        <w:t>remoção de ruído.</w:t>
+      </w:r>
+    </w:p>
+    <w:p>
+      <w:pPr>
+        <w:pStyle w:val="PargrafodaLista"/>
+        <w:numPr>
+          <w:ilvl w:val="0"/>
+          <w:numId w:val="2"/>
+        </w:numPr>
+        <w:jc w:val="both"/>
+        <w:rPr>
+          <w:rFonts w:asciiTheme="minorHAnsi" w:hAnsiTheme="minorHAnsi"/>
+        </w:rPr>
+      </w:pPr>
+      <w:r>
+        <w:rPr>
+          <w:rFonts w:asciiTheme="minorHAnsi" w:hAnsiTheme="minorHAnsi"/>
+        </w:rPr>
+        <w:t xml:space="preserve">Extrair </w:t>
+      </w:r>
+      <w:proofErr w:type="spellStart"/>
+      <w:r>
+        <w:rPr>
+          <w:rFonts w:asciiTheme="minorHAnsi" w:hAnsiTheme="minorHAnsi"/>
+        </w:rPr>
+        <w:t>bounding</w:t>
+      </w:r>
+      <w:proofErr w:type="spellEnd"/>
+      <w:r>
+        <w:rPr>
+          <w:rFonts w:asciiTheme="minorHAnsi" w:hAnsiTheme="minorHAnsi"/>
+        </w:rPr>
+        <w:t xml:space="preserve"> boxes e centroides das regiões ativas de cada </w:t>
+      </w:r>
+      <w:proofErr w:type="spellStart"/>
+      <w:r>
+        <w:rPr>
+          <w:rFonts w:asciiTheme="minorHAnsi" w:hAnsiTheme="minorHAnsi"/>
+        </w:rPr>
+        <w:t>frame</w:t>
+      </w:r>
+      <w:proofErr w:type="spellEnd"/>
+      <w:r>
+        <w:rPr>
+          <w:rFonts w:asciiTheme="minorHAnsi" w:hAnsiTheme="minorHAnsi"/>
+        </w:rPr>
+        <w:t>.</w:t>
+      </w:r>
+    </w:p>
+    <w:p>
+      <w:pPr>
+        <w:pStyle w:val="PargrafodaLista"/>
+        <w:numPr>
+          <w:ilvl w:val="0"/>
+          <w:numId w:val="2"/>
+        </w:numPr>
+        <w:jc w:val="both"/>
+        <w:rPr>
+          <w:rFonts w:asciiTheme="minorHAnsi" w:hAnsiTheme="minorHAnsi"/>
+        </w:rPr>
+      </w:pPr>
+      <w:r>
+        <w:rPr>
+          <w:rFonts w:asciiTheme="minorHAnsi" w:hAnsiTheme="minorHAnsi"/>
+        </w:rPr>
+        <w:t xml:space="preserve">Atribuir identificadores únicos a cada veículo, mantendo a sua correspondência ao longo do vídeo através </w:t>
+      </w:r>
+      <w:r>
+        <w:rPr>
+          <w:rFonts w:asciiTheme="minorHAnsi" w:hAnsiTheme="minorHAnsi"/>
+        </w:rPr>
+        <w:t xml:space="preserve">da </w:t>
+      </w:r>
+      <w:r>
+        <w:rPr>
+          <w:rFonts w:asciiTheme="minorHAnsi" w:hAnsiTheme="minorHAnsi"/>
+        </w:rPr>
+        <w:t>associaç</w:t>
+      </w:r>
+      <w:r>
+        <w:rPr>
+          <w:rFonts w:asciiTheme="minorHAnsi" w:hAnsiTheme="minorHAnsi"/>
+        </w:rPr>
+        <w:t xml:space="preserve">ão </w:t>
+      </w:r>
+      <w:r>
+        <w:rPr>
+          <w:rFonts w:asciiTheme="minorHAnsi" w:hAnsiTheme="minorHAnsi"/>
+        </w:rPr>
+        <w:t>basead</w:t>
+      </w:r>
+      <w:r>
+        <w:rPr>
+          <w:rFonts w:asciiTheme="minorHAnsi" w:hAnsiTheme="minorHAnsi"/>
+        </w:rPr>
+        <w:t xml:space="preserve">a </w:t>
+      </w:r>
+      <w:r>
+        <w:rPr>
+          <w:rFonts w:asciiTheme="minorHAnsi" w:hAnsiTheme="minorHAnsi"/>
+        </w:rPr>
+        <w:t xml:space="preserve">na </w:t>
+      </w:r>
+      <w:r>
+        <w:rPr>
+          <w:rFonts w:asciiTheme="minorHAnsi" w:hAnsiTheme="minorHAnsi"/>
+        </w:rPr>
+        <w:t xml:space="preserve"> distância</w:t>
+      </w:r>
+      <w:r>
+        <w:rPr>
+          <w:rFonts w:asciiTheme="minorHAnsi" w:hAnsiTheme="minorHAnsi"/>
+        </w:rPr>
+        <w:t xml:space="preserve"> dos centroides</w:t>
+      </w:r>
+      <w:r>
+        <w:rPr>
+          <w:rFonts w:asciiTheme="minorHAnsi" w:hAnsiTheme="minorHAnsi"/>
+        </w:rPr>
+        <w:t>.</w:t>
+      </w:r>
+    </w:p>
+    <w:p>
+      <w:pPr>
+        <w:pStyle w:val="PargrafodaLista"/>
+        <w:numPr>
+          <w:ilvl w:val="0"/>
+          <w:numId w:val="2"/>
+        </w:numPr>
+        <w:jc w:val="both"/>
+        <w:rPr>
+          <w:rFonts w:asciiTheme="minorHAnsi" w:hAnsiTheme="minorHAnsi"/>
+        </w:rPr>
+      </w:pPr>
+      <w:r>
+        <w:rPr>
+          <w:rFonts w:asciiTheme="minorHAnsi" w:hAnsiTheme="minorHAnsi"/>
+        </w:rPr>
+        <w:t xml:space="preserve">Calculo da velocidade </w:t>
+      </w:r>
+      <w:r>
+        <w:rPr>
+          <w:rFonts w:asciiTheme="minorHAnsi" w:hAnsiTheme="minorHAnsi"/>
+        </w:rPr>
+        <w:t xml:space="preserve">de cada veiculo, baseado </w:t>
+      </w:r>
+      <w:r>
+        <w:rPr>
+          <w:rFonts w:asciiTheme="minorHAnsi" w:hAnsiTheme="minorHAnsi"/>
+        </w:rPr>
+        <w:t>em associações do vídeo</w:t>
+      </w:r>
+    </w:p>
+    <w:p>
+      <w:pPr>
+        <w:pStyle w:val="PargrafodaLista"/>
+        <w:numPr>
+          <w:ilvl w:val="0"/>
+          <w:numId w:val="2"/>
+        </w:numPr>
+        <w:jc w:val="both"/>
+        <w:rPr>
+          <w:rFonts w:asciiTheme="minorHAnsi" w:hAnsiTheme="minorHAnsi"/>
+        </w:rPr>
+      </w:pPr>
+      <w:r>
+        <w:rPr>
+          <w:rFonts w:asciiTheme="minorHAnsi" w:hAnsiTheme="minorHAnsi"/>
+        </w:rPr>
+        <w:t>Exibição de todo o algoritmo num janela.</w:t>
+      </w:r>
+    </w:p>
+    <w:p>
+      <w:pPr>
+        <w:jc w:val="both"/>
+        <w:rPr>
+          <w:rFonts w:asciiTheme="minorHAnsi" w:hAnsiTheme="minorHAnsi"/>
+        </w:rPr>
+      </w:pPr>
+    </w:p>
+    <w:p>
+      <w:pPr>
+        <w:jc w:val="both"/>
+        <w:rPr>
+          <w:rFonts w:asciiTheme="minorHAnsi" w:hAnsiTheme="minorHAnsi"/>
+        </w:rPr>
+      </w:pPr>
+    </w:p>
+    <w:p>
+      <w:pPr>
+        <w:jc w:val="both"/>
+        <w:rPr>
+          <w:rFonts w:asciiTheme="minorHAnsi" w:hAnsiTheme="minorHAnsi"/>
+        </w:rPr>
+      </w:pPr>
+    </w:p>
+    <w:p>
+      <w:pPr>
+        <w:jc w:val="both"/>
+        <w:rPr>
+          <w:rFonts w:asciiTheme="minorHAnsi" w:hAnsiTheme="minorHAnsi"/>
+        </w:rPr>
+      </w:pPr>
+    </w:p>
+    <w:p>
+      <w:pPr>
+        <w:pStyle w:val="Ttulo1"/>
+      </w:pPr>
+      <w:bookmarkStart w:id="8" w:name="_Toc214535272"/>
+      <w:bookmarkEnd w:id="1"/>
+      <w:r>
+        <w:lastRenderedPageBreak/>
+        <w:t>Metodologia</w:t>
+      </w:r>
+      <w:bookmarkEnd w:id="8"/>
+    </w:p>
+    <w:p>
+      <w:pPr>
+        <w:suppressAutoHyphens w:val="0"/>
+      </w:pPr>
+      <w:r>
+        <w:br w:type="page"/>
+      </w:r>
     </w:p>
     <w:p>
       <w:pPr>
         <w:pStyle w:val="Ttulo1"/>
         <w:jc w:val="both"/>
       </w:pPr>
-      <w:bookmarkStart w:id="8" w:name="_Toc214535272"/>
-      <w:bookmarkEnd w:id="1"/>
-      <w:r>
-        <w:t>Metodologia</w:t>
-      </w:r>
-      <w:bookmarkEnd w:id="8"/>
-    </w:p>
-    <w:p>
-      <w:pPr>
-        <w:suppressAutoHyphens w:val="0"/>
-      </w:pPr>
-      <w:r>
-        <w:br w:type="page"/>
-      </w:r>
-    </w:p>
-    <w:p>
-      <w:pPr>
-        <w:pStyle w:val="Ttulo1"/>
-      </w:pPr>
-      <w:bookmarkStart w:id="9" w:name="_Toc214535273"/>
+      <w:bookmarkStart w:id="9" w:name="_Toc212040804"/>
+      <w:bookmarkStart w:id="10" w:name="_Toc214535275"/>
       <w:r>
         <w:lastRenderedPageBreak/>
-        <w:t>Fundamentos Teóricos</w:t>
-      </w:r>
-      <w:bookmarkEnd w:id="9"/>
+        <w:t>Estimação da imagem de fundo</w:t>
+      </w:r>
+      <w:bookmarkEnd w:id="10"/>
+    </w:p>
+    <w:p/>
+    <w:p>
+      <w:pPr>
+        <w:jc w:val="both"/>
+      </w:pPr>
+      <w:r>
+        <w:t>A determinação da imagem de fundo é realizada a partir d</w:t>
+      </w:r>
+      <w:r>
+        <w:t>as</w:t>
+      </w:r>
+      <w:r>
+        <w:t xml:space="preserve"> várias amostras do vídeo, selecionadas ao longo </w:t>
+      </w:r>
+      <w:r>
+        <w:t>do vídeo</w:t>
+      </w:r>
+      <w:r>
+        <w:t xml:space="preserve">. Para cada </w:t>
+      </w:r>
+      <w:proofErr w:type="spellStart"/>
+      <w:r>
+        <w:t>frame</w:t>
+      </w:r>
+      <w:proofErr w:type="spellEnd"/>
+      <w:r>
+        <w:t xml:space="preserve"> amostrado, a região onde não existem veículos permanece relativamente constante, enquanto os veículos aparecem temporariamente. Ao calcular a mediana pixel a pixel entre todas as frames amostradas, os elementos </w:t>
+      </w:r>
+      <w:r>
+        <w:t xml:space="preserve">não constantes </w:t>
+      </w:r>
+      <w:r>
+        <w:t xml:space="preserve">são removidos, dado que surgem com </w:t>
+      </w:r>
+      <w:r>
+        <w:t xml:space="preserve">uma </w:t>
+      </w:r>
+      <w:r>
+        <w:t>baixa frequência, enquanto as partes estáticas do cenário prevalecem. O resultado é uma estimativa do fundo sem veículos, que será posteriormente utilizada na deteção d</w:t>
+      </w:r>
+      <w:r>
+        <w:t>o</w:t>
+      </w:r>
+      <w:r>
+        <w:t xml:space="preserve"> movimento.</w:t>
+      </w:r>
       <w:r>
         <w:t xml:space="preserve"> </w:t>
       </w:r>
     </w:p>
     <w:p>
       <w:pPr>
+        <w:keepNext/>
         <w:jc w:val="both"/>
       </w:pPr>
-    </w:p>
-    <w:p>
-      <w:pPr>
-        <w:suppressAutoHyphens w:val="0"/>
-        <w:ind w:firstLine="432"/>
+      <w:r>
+        <w:rPr>
+          <w:noProof/>
+        </w:rPr>
+        <w:drawing>
+          <wp:inline distT="0" distB="0" distL="0" distR="0" wp14:anchorId="681CACB7" wp14:editId="31C88803">
+            <wp:extent cx="4876800" cy="3914775"/>
+            <wp:effectExtent l="0" t="0" r="0" b="9525"/>
+            <wp:docPr id="240993084" name="Imagem 1" descr="Uma imagem com cena, percurso, caminho, ar livre&#10;&#10;Os conteúdos gerados por IA podem estar incorretos."/>
+            <wp:cNvGraphicFramePr>
+              <a:graphicFrameLocks xmlns:a="http://schemas.openxmlformats.org/drawingml/2006/main" noChangeAspect="1"/>
+            </wp:cNvGraphicFramePr>
+            <a:graphic xmlns:a="http://schemas.openxmlformats.org/drawingml/2006/main">
+              <a:graphicData uri="http://schemas.openxmlformats.org/drawingml/2006/picture">
+                <pic:pic xmlns:pic="http://schemas.openxmlformats.org/drawingml/2006/picture">
+                  <pic:nvPicPr>
+                    <pic:cNvPr id="240993084" name="Imagem 1" descr="Uma imagem com cena, percurso, caminho, ar livre&#10;&#10;Os conteúdos gerados por IA podem estar incorretos."/>
+                    <pic:cNvPicPr/>
+                  </pic:nvPicPr>
+                  <pic:blipFill>
+                    <a:blip r:embed="rId11"/>
+                    <a:stretch>
+                      <a:fillRect/>
+                    </a:stretch>
+                  </pic:blipFill>
+                  <pic:spPr>
+                    <a:xfrm>
+                      <a:off x="0" y="0"/>
+                      <a:ext cx="4876800" cy="3914775"/>
+                    </a:xfrm>
+                    <a:prstGeom prst="rect">
+                      <a:avLst/>
+                    </a:prstGeom>
+                  </pic:spPr>
+                </pic:pic>
+              </a:graphicData>
+            </a:graphic>
+          </wp:inline>
+        </w:drawing>
+      </w:r>
+    </w:p>
+    <w:p>
+      <w:pPr>
+        <w:pStyle w:val="Legenda"/>
         <w:jc w:val="both"/>
       </w:pPr>
       <w:r>
-        <w:t>Abertura: Operação morfológica composta pela erosão seguida de uma dilatação usando o mesmo elemento estruturante. Possui como principal objetivo eliminar pequenos objetos ou ruido isolado da imagem.</w:t>
-      </w:r>
-    </w:p>
-    <w:p>
-      <w:pPr>
-        <w:suppressAutoHyphens w:val="0"/>
-        <w:ind w:firstLine="432"/>
-        <w:jc w:val="both"/>
-      </w:pPr>
-      <w:r>
-        <w:t xml:space="preserve">Fecho: Operação morfológica composta pela dilatação seguida de erosão, com o mesmo elemento estruturante. Empregue para </w:t>
-      </w:r>
-      <w:r>
-        <w:t>preencher</w:t>
-      </w:r>
-      <w:r>
-        <w:t xml:space="preserve"> </w:t>
-      </w:r>
-      <w:r>
-        <w:t>pequenos</w:t>
-      </w:r>
-      <w:r>
-        <w:t xml:space="preserve"> buracos e unir descontinuidades nos contornos de regiões </w:t>
-      </w:r>
-      <w:r>
-        <w:t>brancas</w:t>
-      </w:r>
-      <w:r>
-        <w:t>, nomeadamente objetos</w:t>
-      </w:r>
-    </w:p>
-    <w:p>
-      <w:pPr>
-        <w:suppressAutoHyphens w:val="0"/>
-        <w:ind w:firstLine="432"/>
-        <w:jc w:val="both"/>
-      </w:pPr>
-      <w:r>
-        <w:t>Erosão: Permite reduzir o tamanho das regiões brancas duma imagem binaria, removendo os pixéis das fronteiras. P</w:t>
-      </w:r>
-      <w:r>
-        <w:t>ossui como efeito separar objetos próximos e eliminar imperfeições pequenas.</w:t>
-      </w:r>
-    </w:p>
-    <w:p>
-      <w:pPr>
-        <w:suppressAutoHyphens w:val="0"/>
-        <w:ind w:firstLine="432"/>
-        <w:jc w:val="both"/>
-      </w:pPr>
-      <w:r>
-        <w:t>Dilatação: Processo inverso á erosão, consistindo na expansão das regiões brancas da imagem, acrescentando pixéis brancos nas fronteiras.</w:t>
-      </w:r>
-    </w:p>
-    <w:p>
-      <w:pPr>
-        <w:suppressAutoHyphens w:val="0"/>
-        <w:ind w:firstLine="432"/>
-        <w:jc w:val="both"/>
-      </w:pPr>
-      <w:r>
-        <w:t xml:space="preserve">Binarização: Processo de converter uma imagem noutro com </w:t>
-      </w:r>
-      <w:r>
-        <w:t>pixéis</w:t>
-      </w:r>
-      <w:r>
-        <w:t xml:space="preserve"> a branco com valor 255e preto com valor 0.</w:t>
-      </w:r>
-    </w:p>
-    <w:p>
-      <w:pPr>
-        <w:suppressAutoHyphens w:val="0"/>
-        <w:ind w:firstLine="432"/>
-        <w:jc w:val="both"/>
-      </w:pPr>
-      <w:r>
-        <w:t xml:space="preserve">Matriz de confusão: Representação que permite comparar as classes verdadeiras das classes preditas pelo sistema de classificação. Cada linha corresponde á </w:t>
-      </w:r>
-      <w:r>
-        <w:t>classe</w:t>
-      </w:r>
-      <w:r>
-        <w:t xml:space="preserve"> verdadeira e cada coluna á classe predita. Os valores na diagonal indicam a classificação correta, enquanto os restantes representam os erros.</w:t>
-      </w:r>
-      <w:r>
-        <w:t xml:space="preserve"> Permite calcular outras métricas de desempenho, como a precisão e probabilidade de erro.</w:t>
+        <w:t xml:space="preserve">Figura </w:t>
+      </w:r>
+      <w:fldSimple w:instr=" SEQ Figura \* ARABIC ">
+        <w:r>
+          <w:rPr>
+            <w:noProof/>
+          </w:rPr>
+          <w:t>1</w:t>
+        </w:r>
+      </w:fldSimple>
+      <w:r>
+        <w:t xml:space="preserve"> Imagem da Estrada</w:t>
       </w:r>
     </w:p>
     <w:p>
@@ -2529,93 +3136,339 @@
         <w:pStyle w:val="Ttulo1"/>
         <w:jc w:val="both"/>
       </w:pPr>
-      <w:bookmarkStart w:id="10" w:name="_Toc214535274"/>
-      <w:r>
-        <w:t>Introdução</w:t>
-      </w:r>
-      <w:bookmarkStart w:id="11" w:name="_Toc212040804"/>
-      <w:bookmarkEnd w:id="10"/>
-    </w:p>
-    <w:p>
-      <w:pPr>
-        <w:suppressAutoHyphens w:val="0"/>
-        <w:rPr>
-          <w:rFonts w:ascii="Aptos Display" w:eastAsia="DengXian Light" w:hAnsi="Aptos Display"/>
-          <w:color w:val="0F4761"/>
-          <w:sz w:val="40"/>
-          <w:szCs w:val="40"/>
-        </w:rPr>
-      </w:pPr>
-      <w:r>
-        <w:br w:type="page"/>
+      <w:bookmarkStart w:id="11" w:name="_Toc214535276"/>
+      <w:r>
+        <w:t>Deteção de pixéis ativos</w:t>
+      </w:r>
+      <w:bookmarkEnd w:id="11"/>
+    </w:p>
+    <w:p/>
+    <w:p>
+      <w:pPr>
+        <w:jc w:val="both"/>
+      </w:pPr>
+      <w:r>
+        <w:t xml:space="preserve">Para isolar exclusivamente os </w:t>
+      </w:r>
+      <w:r>
+        <w:t>pixéis</w:t>
+      </w:r>
+      <w:r>
+        <w:t xml:space="preserve"> correspondentes dos veículos em movimento, procede-se á operação da </w:t>
+      </w:r>
+      <w:r>
+        <w:t>subtração</w:t>
+      </w:r>
+      <w:r>
+        <w:t xml:space="preserve"> </w:t>
+      </w:r>
+      <w:r>
+        <w:t xml:space="preserve">entre as duas imagens, o primeiro que representa a autoestrada com o trafego e a segunda que </w:t>
+      </w:r>
+      <w:r>
+        <w:t>constitui a imagem de fundo. A diferença entre as duas imagens evidencia as regiões onde ocorrem as alterações provocadas pelo movimento dos carros.</w:t>
+      </w:r>
+    </w:p>
+    <w:p>
+      <w:pPr>
+        <w:jc w:val="both"/>
+      </w:pPr>
+      <w:r>
+        <w:lastRenderedPageBreak/>
+        <w:t xml:space="preserve">Primeiro, deve-se converter ambas as fotos para a </w:t>
+      </w:r>
+      <w:r>
+        <w:t>escala</w:t>
+      </w:r>
+      <w:r>
+        <w:t xml:space="preserve"> de cinzento. Permitindo simplificar o processo da comparação entre os frames, reduzindo os </w:t>
+      </w:r>
+      <w:proofErr w:type="spellStart"/>
+      <w:r>
+        <w:t>yres</w:t>
+      </w:r>
+      <w:proofErr w:type="spellEnd"/>
+      <w:r>
+        <w:t xml:space="preserve"> canais de cor(RGB) </w:t>
+      </w:r>
+      <w:r>
+        <w:t xml:space="preserve">para apenas um. A </w:t>
+      </w:r>
+      <w:r>
+        <w:t>deteção</w:t>
+      </w:r>
+      <w:r>
+        <w:t xml:space="preserve"> de movimento é maioritariamente observada pela variação da luminância e não na variação de cor, onde a conversão para cinzento é ideal.</w:t>
+      </w:r>
+    </w:p>
+    <w:p>
+      <w:r>
+        <w:t xml:space="preserve">A subtração absoluta entre as fotos é realizada através da função </w:t>
+      </w:r>
+      <w:r>
+        <w:rPr>
+          <w:i/>
+          <w:iCs/>
+        </w:rPr>
+        <w:t>cv2.absdiff(),</w:t>
+      </w:r>
+      <w:r>
+        <w:t xml:space="preserve"> que devolve, para cada pixel, a </w:t>
+      </w:r>
+      <w:r>
+        <w:t>diferença</w:t>
+      </w:r>
+      <w:r>
+        <w:t xml:space="preserve"> em valor absoluto </w:t>
+      </w:r>
+      <w:r>
+        <w:t xml:space="preserve">as intensidades correspondentes nas duas imagens. O resultado desta operação </w:t>
+      </w:r>
+      <w:r>
+        <w:t>exibe as zonas onde o brilho sofreu variações, informado do movimento dos carros.</w:t>
+      </w:r>
+    </w:p>
+    <w:p>
+      <w:r>
+        <w:t xml:space="preserve">Posteriormente, </w:t>
+      </w:r>
+      <w:r>
+        <w:t>o resultado é suavizado com um filtro de média e um filtro gaussiano.</w:t>
+      </w:r>
+      <w:r>
+        <w:t xml:space="preserve"> Reduzindo </w:t>
+      </w:r>
+      <w:r>
+        <w:t xml:space="preserve">o ruido, e permitindo unir os veículos, que muitas vezes </w:t>
+      </w:r>
+      <w:r>
+        <w:t xml:space="preserve">não se apresentam fechados, sendo importante a ligação de todas as manchas correspondentes a um carro </w:t>
+      </w:r>
+      <w:r>
+        <w:t>para o calculo das regiões ativas.</w:t>
+      </w:r>
+    </w:p>
+    <w:p>
+      <w:r>
+        <w:t xml:space="preserve">Por fim, </w:t>
+      </w:r>
+      <w:r>
+        <w:t xml:space="preserve">aplica-se </w:t>
+      </w:r>
+      <w:r>
+        <w:t xml:space="preserve">um limiar á imagem, utilizando o método de Otsu, que determina de forma </w:t>
+      </w:r>
+      <w:r>
+        <w:t>autónoma</w:t>
+      </w:r>
+      <w:r>
+        <w:t xml:space="preserve"> o valor </w:t>
+      </w:r>
+      <w:r>
+        <w:t>ótimo</w:t>
+      </w:r>
+      <w:r>
+        <w:t xml:space="preserve"> para a separação entre os pixéis relevantes, que representam o movimento, </w:t>
+      </w:r>
+      <w:r>
+        <w:t xml:space="preserve">e os </w:t>
+      </w:r>
+      <w:r>
+        <w:t>pixels</w:t>
+      </w:r>
+      <w:r>
+        <w:t xml:space="preserve"> </w:t>
+      </w:r>
+      <w:r>
+        <w:t>d</w:t>
+      </w:r>
+      <w:r>
+        <w:t>o fundo. O resultado é uma imagem binaria onde os veículos surgem destacados em branco sobre o fundo negro, facilitando a posterior segmentação</w:t>
+      </w:r>
+      <w:r>
+        <w:t>.</w:t>
+      </w:r>
+    </w:p>
+    <w:p/>
+    <w:p>
+      <w:pPr>
+        <w:keepNext/>
+      </w:pPr>
+      <w:r>
+        <w:rPr>
+          <w:noProof/>
+        </w:rPr>
+        <w:drawing>
+          <wp:inline distT="0" distB="0" distL="0" distR="0" wp14:anchorId="5761D54E" wp14:editId="7CB4090B">
+            <wp:extent cx="6066048" cy="1667022"/>
+            <wp:effectExtent l="0" t="0" r="0" b="9525"/>
+            <wp:docPr id="1542112604" name="Imagem 1" descr="Uma imagem com captura de ecrã, preto&#10;&#10;Os conteúdos gerados por IA podem estar incorretos."/>
+            <wp:cNvGraphicFramePr>
+              <a:graphicFrameLocks xmlns:a="http://schemas.openxmlformats.org/drawingml/2006/main" noChangeAspect="1"/>
+            </wp:cNvGraphicFramePr>
+            <a:graphic xmlns:a="http://schemas.openxmlformats.org/drawingml/2006/main">
+              <a:graphicData uri="http://schemas.openxmlformats.org/drawingml/2006/picture">
+                <pic:pic xmlns:pic="http://schemas.openxmlformats.org/drawingml/2006/picture">
+                  <pic:nvPicPr>
+                    <pic:cNvPr id="1542112604" name="Imagem 1" descr="Uma imagem com captura de ecrã, preto&#10;&#10;Os conteúdos gerados por IA podem estar incorretos."/>
+                    <pic:cNvPicPr/>
+                  </pic:nvPicPr>
+                  <pic:blipFill>
+                    <a:blip r:embed="rId12"/>
+                    <a:stretch>
+                      <a:fillRect/>
+                    </a:stretch>
+                  </pic:blipFill>
+                  <pic:spPr>
+                    <a:xfrm>
+                      <a:off x="0" y="0"/>
+                      <a:ext cx="6068748" cy="1667764"/>
+                    </a:xfrm>
+                    <a:prstGeom prst="rect">
+                      <a:avLst/>
+                    </a:prstGeom>
+                  </pic:spPr>
+                </pic:pic>
+              </a:graphicData>
+            </a:graphic>
+          </wp:inline>
+        </w:drawing>
+      </w:r>
+    </w:p>
+    <w:p>
+      <w:pPr>
+        <w:pStyle w:val="Legenda"/>
+      </w:pPr>
+      <w:r>
+        <w:t xml:space="preserve">Figura </w:t>
+      </w:r>
+      <w:fldSimple w:instr=" SEQ Figura \* ARABIC ">
+        <w:r>
+          <w:rPr>
+            <w:noProof/>
+          </w:rPr>
+          <w:t>2</w:t>
+        </w:r>
+      </w:fldSimple>
+      <w:r>
+        <w:t xml:space="preserve"> Etapa da dos resultados</w:t>
+      </w:r>
+    </w:p>
+    <w:p/>
+    <w:p>
+      <w:r>
+        <w:t xml:space="preserve">Na imagem 2 </w:t>
+      </w:r>
+      <w:r>
+        <w:t xml:space="preserve">observa-se que a imagem central representa </w:t>
+      </w:r>
+      <w:r>
+        <w:t>os veículos em movimen</w:t>
+      </w:r>
+      <w:r>
+        <w:t xml:space="preserve">to </w:t>
+      </w:r>
+      <w:r>
+        <w:t xml:space="preserve">com um desfoco </w:t>
+      </w:r>
+      <w:r>
+        <w:t xml:space="preserve">provindo dos filtros. </w:t>
+      </w:r>
+      <w:r>
+        <w:t>Com o processamento do limiar, todo o contorno é transformado numa mancha branca.</w:t>
       </w:r>
     </w:p>
     <w:p>
       <w:pPr>
         <w:pStyle w:val="Ttulo1"/>
-        <w:jc w:val="both"/>
-      </w:pPr>
-      <w:bookmarkStart w:id="12" w:name="_Toc214535275"/>
+      </w:pPr>
+      <w:bookmarkStart w:id="12" w:name="_Toc212040805"/>
+      <w:bookmarkEnd w:id="9"/>
       <w:r>
         <w:lastRenderedPageBreak/>
-        <w:t>Estimação da imagem de fundo</w:t>
+        <w:t xml:space="preserve"> </w:t>
+      </w:r>
+      <w:bookmarkStart w:id="13" w:name="_Toc214535277"/>
+      <w:r>
+        <w:t>Melhoramento da Imagem</w:t>
       </w:r>
       <w:bookmarkEnd w:id="12"/>
       <w:r>
+        <w:t xml:space="preserve"> com Operadores</w:t>
+      </w:r>
+      <w:r>
         <w:t xml:space="preserve"> </w:t>
       </w:r>
+      <w:r>
+        <w:t>Morfológicos</w:t>
+      </w:r>
+      <w:bookmarkEnd w:id="13"/>
     </w:p>
     <w:p>
       <w:pPr>
         <w:pStyle w:val="Ttulo1"/>
-        <w:jc w:val="both"/>
-      </w:pPr>
-      <w:bookmarkStart w:id="13" w:name="_Toc214535276"/>
+      </w:pPr>
       <w:r>
         <w:t xml:space="preserve"> </w:t>
       </w:r>
-      <w:r>
-        <w:t>Deteção de pixéis ativos</w:t>
-      </w:r>
-      <w:bookmarkEnd w:id="13"/>
+      <w:bookmarkStart w:id="14" w:name="_Toc214535278"/>
+      <w:r>
+        <w:t>Deteção de regiões ativas</w:t>
+      </w:r>
+      <w:bookmarkEnd w:id="14"/>
     </w:p>
     <w:p>
       <w:pPr>
         <w:pStyle w:val="Ttulo1"/>
       </w:pPr>
-      <w:bookmarkStart w:id="14" w:name="_Toc212040805"/>
-      <w:bookmarkEnd w:id="11"/>
       <w:r>
         <w:t xml:space="preserve"> </w:t>
       </w:r>
-      <w:bookmarkStart w:id="15" w:name="_Toc214535277"/>
-      <w:r>
-        <w:t>Melhoramento da Imagem</w:t>
-      </w:r>
-      <w:bookmarkEnd w:id="14"/>
-      <w:r>
-        <w:t xml:space="preserve"> com Operadores</w:t>
-      </w:r>
+      <w:bookmarkStart w:id="15" w:name="_Toc214535279"/>
+      <w:r>
+        <w:t>Correspondência de regiões entre imagens consecutivas</w:t>
+      </w:r>
+      <w:bookmarkEnd w:id="15"/>
       <w:r>
         <w:t xml:space="preserve"> </w:t>
       </w:r>
-      <w:r>
-        <w:t>Morfológicos</w:t>
-      </w:r>
-      <w:bookmarkEnd w:id="15"/>
     </w:p>
     <w:p>
       <w:pPr>
         <w:pStyle w:val="Ttulo1"/>
       </w:pPr>
       <w:r>
+        <w:t xml:space="preserve"> Determinação da velocidade dos carros</w:t>
+      </w:r>
+    </w:p>
+    <w:p>
+      <w:r>
+        <w:t xml:space="preserve">Aqui aplicar o </w:t>
+      </w:r>
+      <w:proofErr w:type="spellStart"/>
+      <w:r>
+        <w:t>resizde</w:t>
+      </w:r>
+      <w:proofErr w:type="spellEnd"/>
+      <w:r>
+        <w:t xml:space="preserve"> da imagem para determinar a velo dos carros</w:t>
+      </w:r>
+    </w:p>
+    <w:p>
+      <w:pPr>
+        <w:pStyle w:val="Ttulo1"/>
+      </w:pPr>
+      <w:r>
         <w:t xml:space="preserve"> </w:t>
       </w:r>
-      <w:bookmarkStart w:id="16" w:name="_Toc214535278"/>
-      <w:r>
-        <w:t>Deteção de regiões ativas</w:t>
+      <w:bookmarkStart w:id="16" w:name="_Toc214535280"/>
+      <w:r>
+        <w:t>Visualização dos resultados do processamento</w:t>
       </w:r>
       <w:bookmarkEnd w:id="16"/>
+      <w:r>
+        <w:t xml:space="preserve"> </w:t>
+      </w:r>
     </w:p>
     <w:p>
       <w:pPr>
@@ -2624,38 +3477,26 @@
       <w:r>
         <w:t xml:space="preserve"> </w:t>
       </w:r>
-      <w:bookmarkStart w:id="17" w:name="_Toc214535279"/>
-      <w:r>
-        <w:t>Correspondência de regiões entre imagens consecutivas</w:t>
+      <w:bookmarkStart w:id="17" w:name="_Toc214535281"/>
+      <w:r>
+        <w:t>Conclusões</w:t>
       </w:r>
       <w:bookmarkEnd w:id="17"/>
       <w:r>
         <w:t xml:space="preserve"> </w:t>
       </w:r>
     </w:p>
+    <w:p/>
     <w:p>
       <w:pPr>
         <w:pStyle w:val="Ttulo1"/>
       </w:pPr>
       <w:r>
-        <w:t xml:space="preserve"> Determinação da velocidade dos carros</w:t>
-      </w:r>
-    </w:p>
-    <w:p>
-      <w:r>
-        <w:t>Aqui aplicar o resizde da imagem para determinar a velo dos carros</w:t>
-      </w:r>
-    </w:p>
-    <w:p>
-      <w:pPr>
-        <w:pStyle w:val="Ttulo1"/>
-      </w:pPr>
-      <w:r>
         <w:t xml:space="preserve"> </w:t>
       </w:r>
-      <w:bookmarkStart w:id="18" w:name="_Toc214535280"/>
-      <w:r>
-        <w:t>Visualização dos resultados do processamento</w:t>
+      <w:bookmarkStart w:id="18" w:name="_Toc214535282"/>
+      <w:r>
+        <w:t>Referencias</w:t>
       </w:r>
       <w:bookmarkEnd w:id="18"/>
       <w:r>
@@ -2663,40 +3504,7 @@
       </w:r>
     </w:p>
     <w:p>
-      <w:pPr>
-        <w:pStyle w:val="Ttulo1"/>
-      </w:pPr>
-      <w:r>
-        <w:t xml:space="preserve"> </w:t>
-      </w:r>
-      <w:bookmarkStart w:id="19" w:name="_Toc214535281"/>
-      <w:r>
-        <w:t>Conclusões</w:t>
-      </w:r>
-      <w:bookmarkEnd w:id="19"/>
-      <w:r>
-        <w:t xml:space="preserve"> </w:t>
-      </w:r>
-    </w:p>
-    <w:p/>
-    <w:p>
-      <w:pPr>
-        <w:pStyle w:val="Ttulo1"/>
-      </w:pPr>
-      <w:r>
-        <w:t xml:space="preserve"> </w:t>
-      </w:r>
-      <w:bookmarkStart w:id="20" w:name="_Toc214535282"/>
-      <w:r>
-        <w:t>Referencias</w:t>
-      </w:r>
-      <w:bookmarkEnd w:id="20"/>
-      <w:r>
-        <w:t xml:space="preserve"> </w:t>
-      </w:r>
-    </w:p>
-    <w:p>
-      <w:hyperlink r:id="rId11" w:history="1">
+      <w:hyperlink r:id="rId13" w:history="1">
         <w:r>
           <w:rPr>
             <w:rStyle w:val="Hiperligao"/>
@@ -2708,7 +3516,7 @@
     <w:p/>
     <w:p/>
     <w:sectPr>
-      <w:footerReference w:type="default" r:id="rId12"/>
+      <w:footerReference w:type="default" r:id="rId14"/>
       <w:pgSz w:w="11906" w:h="16838"/>
       <w:pgMar w:top="1417" w:right="1701" w:bottom="1417" w:left="1701" w:header="720" w:footer="720" w:gutter="0"/>
       <w:cols w:space="720"/>
@@ -4256,6 +5064,7 @@
   <w:style w:type="character" w:customStyle="1" w:styleId="Ttulo1Carter">
     <w:name w:val="Título 1 Caráter"/>
     <w:basedOn w:val="Tipodeletrapredefinidodopargrafo"/>
+    <w:uiPriority w:val="9"/>
     <w:rPr>
       <w:rFonts w:ascii="Aptos Display" w:eastAsia="DengXian Light" w:hAnsi="Aptos Display" w:cs="Times New Roman"/>
       <w:color w:val="0F4761"/>

</xml_diff>